<commit_message>
Pinn_full trained model_ for heat equation
</commit_message>
<xml_diff>
--- a/NOTES.docx
+++ b/NOTES.docx
@@ -18,6 +18,501 @@
     <w:p/>
     <w:p>
       <w:pPr>
+        <w:pStyle w:val="NormalWeb"/>
+      </w:pPr>
+      <w:r>
+        <w:t xml:space="preserve">A PINN </w:t>
+      </w:r>
+      <w:r>
+        <w:rPr>
+          <w:rStyle w:val="Strong"/>
+        </w:rPr>
+        <w:t>learns the solution to a differential equation</w:t>
+      </w:r>
+      <w:r>
+        <w:t xml:space="preserve"> by being penalized whenever it violates:</w:t>
+      </w:r>
+    </w:p>
+    <w:p>
+      <w:pPr>
+        <w:pStyle w:val="NormalWeb"/>
+        <w:numPr>
+          <w:ilvl w:val="0"/>
+          <w:numId w:val="2"/>
+        </w:numPr>
+      </w:pPr>
+      <w:r>
+        <w:t>The PDE</w:t>
+      </w:r>
+    </w:p>
+    <w:p>
+      <w:pPr>
+        <w:pStyle w:val="NormalWeb"/>
+        <w:numPr>
+          <w:ilvl w:val="0"/>
+          <w:numId w:val="2"/>
+        </w:numPr>
+      </w:pPr>
+      <w:r>
+        <w:t>The initial condition</w:t>
+      </w:r>
+    </w:p>
+    <w:p>
+      <w:pPr>
+        <w:pStyle w:val="NormalWeb"/>
+        <w:numPr>
+          <w:ilvl w:val="0"/>
+          <w:numId w:val="2"/>
+        </w:numPr>
+      </w:pPr>
+      <w:r>
+        <w:t>The boundary condition</w:t>
+      </w:r>
+    </w:p>
+    <w:p/>
+    <w:p/>
+    <w:p>
+      <w:r>
+        <w:drawing>
+          <wp:inline distT="0" distB="0" distL="0" distR="0" wp14:anchorId="15E90ECF" wp14:editId="233BB9D7">
+            <wp:extent cx="4149436" cy="1607182"/>
+            <wp:effectExtent l="0" t="0" r="3810" b="0"/>
+            <wp:docPr id="2" name="Picture 2" descr="A math equations with black text&#10;&#10;Description automatically generated with medium confidence"/>
+            <wp:cNvGraphicFramePr>
+              <a:graphicFrameLocks xmlns:a="http://schemas.openxmlformats.org/drawingml/2006/main" noChangeAspect="1"/>
+            </wp:cNvGraphicFramePr>
+            <a:graphic xmlns:a="http://schemas.openxmlformats.org/drawingml/2006/main">
+              <a:graphicData uri="http://schemas.openxmlformats.org/drawingml/2006/picture">
+                <pic:pic xmlns:pic="http://schemas.openxmlformats.org/drawingml/2006/picture">
+                  <pic:nvPicPr>
+                    <pic:cNvPr id="2" name="Picture 2" descr="A math equations with black text&#10;&#10;Description automatically generated with medium confidence"/>
+                    <pic:cNvPicPr/>
+                  </pic:nvPicPr>
+                  <pic:blipFill>
+                    <a:blip r:embed="rId5"/>
+                    <a:stretch>
+                      <a:fillRect/>
+                    </a:stretch>
+                  </pic:blipFill>
+                  <pic:spPr>
+                    <a:xfrm>
+                      <a:off x="0" y="0"/>
+                      <a:ext cx="4153398" cy="1608717"/>
+                    </a:xfrm>
+                    <a:prstGeom prst="rect">
+                      <a:avLst/>
+                    </a:prstGeom>
+                  </pic:spPr>
+                </pic:pic>
+              </a:graphicData>
+            </a:graphic>
+          </wp:inline>
+        </w:drawing>
+      </w:r>
+    </w:p>
+    <w:p/>
+    <w:p>
+      <w:r>
+        <w:drawing>
+          <wp:inline distT="0" distB="0" distL="0" distR="0" wp14:anchorId="1A5CDAE5" wp14:editId="6979D9A5">
+            <wp:extent cx="1669473" cy="333895"/>
+            <wp:effectExtent l="0" t="0" r="0" b="9525"/>
+            <wp:docPr id="3" name="Picture 3" descr="A close up of a number&#10;&#10;Description automatically generated"/>
+            <wp:cNvGraphicFramePr>
+              <a:graphicFrameLocks xmlns:a="http://schemas.openxmlformats.org/drawingml/2006/main" noChangeAspect="1"/>
+            </wp:cNvGraphicFramePr>
+            <a:graphic xmlns:a="http://schemas.openxmlformats.org/drawingml/2006/main">
+              <a:graphicData uri="http://schemas.openxmlformats.org/drawingml/2006/picture">
+                <pic:pic xmlns:pic="http://schemas.openxmlformats.org/drawingml/2006/picture">
+                  <pic:nvPicPr>
+                    <pic:cNvPr id="3" name="Picture 3" descr="A close up of a number&#10;&#10;Description automatically generated"/>
+                    <pic:cNvPicPr/>
+                  </pic:nvPicPr>
+                  <pic:blipFill>
+                    <a:blip r:embed="rId6"/>
+                    <a:stretch>
+                      <a:fillRect/>
+                    </a:stretch>
+                  </pic:blipFill>
+                  <pic:spPr>
+                    <a:xfrm>
+                      <a:off x="0" y="0"/>
+                      <a:ext cx="1677801" cy="335561"/>
+                    </a:xfrm>
+                    <a:prstGeom prst="rect">
+                      <a:avLst/>
+                    </a:prstGeom>
+                  </pic:spPr>
+                </pic:pic>
+              </a:graphicData>
+            </a:graphic>
+          </wp:inline>
+        </w:drawing>
+      </w:r>
+    </w:p>
+    <w:p>
+      <w:r>
+        <w:t>We are creating interior points with a random n points in [0,1]</w:t>
+      </w:r>
+    </w:p>
+    <w:p>
+      <w:r>
+        <w:t xml:space="preserve">Function : </w:t>
+      </w:r>
+      <w:proofErr w:type="spellStart"/>
+      <w:r>
+        <w:t>generate_collocation_points</w:t>
+      </w:r>
+      <w:proofErr w:type="spellEnd"/>
+      <w:r>
+        <w:t>(</w:t>
+      </w:r>
+      <w:proofErr w:type="spellStart"/>
+      <w:r>
+        <w:t>n_points</w:t>
+      </w:r>
+      <w:proofErr w:type="spellEnd"/>
+      <w:r>
+        <w:t xml:space="preserve">, </w:t>
+      </w:r>
+      <w:proofErr w:type="spellStart"/>
+      <w:r>
+        <w:t>x_range</w:t>
+      </w:r>
+      <w:proofErr w:type="spellEnd"/>
+      <w:r>
+        <w:t xml:space="preserve">=(0, 1), </w:t>
+      </w:r>
+      <w:proofErr w:type="spellStart"/>
+      <w:r>
+        <w:t>t_range</w:t>
+      </w:r>
+      <w:proofErr w:type="spellEnd"/>
+      <w:r>
+        <w:t>=(0, 1))</w:t>
+      </w:r>
+    </w:p>
+    <w:p/>
+    <w:p>
+      <w:r>
+        <w:t xml:space="preserve">Now we have interior points, lets define the boundary points </w:t>
+      </w:r>
+    </w:p>
+    <w:p>
+      <w:r>
+        <w:t>1d</w:t>
+      </w:r>
+      <w:r>
+        <w:t xml:space="preserve">  and time </w:t>
+      </w:r>
+      <w:proofErr w:type="spellStart"/>
+      <w:r>
+        <w:t>dependant</w:t>
+      </w:r>
+      <w:proofErr w:type="spellEnd"/>
+      <w:r>
+        <w:t xml:space="preserve"> . so left we have  consider I row of n points , left and right have 0. And this is </w:t>
+      </w:r>
+      <w:proofErr w:type="spellStart"/>
+      <w:r>
+        <w:t>propogating</w:t>
+      </w:r>
+      <w:proofErr w:type="spellEnd"/>
+      <w:r>
+        <w:t xml:space="preserve"> over time. </w:t>
+      </w:r>
+    </w:p>
+    <w:p>
+      <w:r>
+        <w:t xml:space="preserve">Hence we need a vertical stack. </w:t>
+      </w:r>
+    </w:p>
+    <w:p/>
+    <w:p>
+      <w:pPr>
+        <w:rPr>
+          <w:lang w:val="en-DE"/>
+        </w:rPr>
+      </w:pPr>
+      <w:r>
+        <w:t xml:space="preserve">Next we need </w:t>
+      </w:r>
+      <w:proofErr w:type="spellStart"/>
+      <w:r>
+        <w:t>a</w:t>
+      </w:r>
+      <w:proofErr w:type="spellEnd"/>
+      <w:r>
+        <w:t xml:space="preserve"> initial  condition , aka solution at t=0</w:t>
+      </w:r>
+      <w:r>
+        <w:rPr>
+          <w:lang w:val="en-DE"/>
+        </w:rPr>
+        <w:t xml:space="preserve">, this is easy </w:t>
+      </w:r>
+    </w:p>
+    <w:p>
+      <w:pPr>
+        <w:rPr>
+          <w:lang w:val="en-DE"/>
+        </w:rPr>
+      </w:pPr>
+    </w:p>
+    <w:p>
+      <w:pPr>
+        <w:rPr>
+          <w:lang w:val="en-DE"/>
+        </w:rPr>
+      </w:pPr>
+      <w:r>
+        <w:rPr>
+          <w:lang w:val="en-DE"/>
+        </w:rPr>
+        <w:t>Next defining the PINN class</w:t>
+      </w:r>
+    </w:p>
+    <w:p>
+      <w:pPr>
+        <w:spacing w:before="100" w:beforeAutospacing="1" w:after="100" w:afterAutospacing="1" w:line="240" w:lineRule="auto"/>
+        <w:outlineLvl w:val="1"/>
+        <w:rPr>
+          <w:rFonts w:ascii="Times New Roman" w:eastAsia="Times New Roman" w:hAnsi="Times New Roman" w:cs="Times New Roman"/>
+          <w:b/>
+          <w:bCs/>
+          <w:lang w:val="en-IN" w:eastAsia="en-IN"/>
+        </w:rPr>
+      </w:pPr>
+      <w:r>
+        <w:rPr>
+          <w:rFonts w:ascii="Times New Roman" w:eastAsia="Times New Roman" w:hAnsi="Times New Roman" w:cs="Times New Roman"/>
+          <w:b/>
+          <w:bCs/>
+          <w:lang w:val="en-IN" w:eastAsia="en-IN"/>
+        </w:rPr>
+        <w:t xml:space="preserve">Why inherit from </w:t>
+      </w:r>
+      <w:proofErr w:type="spellStart"/>
+      <w:r>
+        <w:rPr>
+          <w:rFonts w:ascii="Courier New" w:eastAsia="Times New Roman" w:hAnsi="Courier New" w:cs="Courier New"/>
+          <w:b/>
+          <w:bCs/>
+          <w:lang w:val="en-IN" w:eastAsia="en-IN"/>
+        </w:rPr>
+        <w:t>tf.keras.Model</w:t>
+      </w:r>
+      <w:proofErr w:type="spellEnd"/>
+      <w:r>
+        <w:rPr>
+          <w:rFonts w:ascii="Times New Roman" w:eastAsia="Times New Roman" w:hAnsi="Times New Roman" w:cs="Times New Roman"/>
+          <w:b/>
+          <w:bCs/>
+          <w:lang w:val="en-IN" w:eastAsia="en-IN"/>
+        </w:rPr>
+        <w:t>?</w:t>
+      </w:r>
+    </w:p>
+    <w:p>
+      <w:pPr>
+        <w:numPr>
+          <w:ilvl w:val="0"/>
+          <w:numId w:val="3"/>
+        </w:numPr>
+        <w:spacing w:before="100" w:beforeAutospacing="1" w:after="100" w:afterAutospacing="1" w:line="240" w:lineRule="auto"/>
+        <w:rPr>
+          <w:rFonts w:ascii="Times New Roman" w:eastAsia="Times New Roman" w:hAnsi="Times New Roman" w:cs="Times New Roman"/>
+          <w:lang w:val="en-IN" w:eastAsia="en-IN"/>
+        </w:rPr>
+      </w:pPr>
+      <w:r>
+        <w:rPr>
+          <w:rFonts w:ascii="Times New Roman" w:eastAsia="Times New Roman" w:hAnsi="Times New Roman" w:cs="Times New Roman"/>
+          <w:lang w:val="en-IN" w:eastAsia="en-IN"/>
+        </w:rPr>
+        <w:t xml:space="preserve">It allows you to </w:t>
+      </w:r>
+      <w:r>
+        <w:rPr>
+          <w:rFonts w:ascii="Times New Roman" w:eastAsia="Times New Roman" w:hAnsi="Times New Roman" w:cs="Times New Roman"/>
+          <w:b/>
+          <w:bCs/>
+          <w:lang w:val="en-IN" w:eastAsia="en-IN"/>
+        </w:rPr>
+        <w:t>define your own architecture and forward pass</w:t>
+      </w:r>
+      <w:r>
+        <w:rPr>
+          <w:rFonts w:ascii="Times New Roman" w:eastAsia="Times New Roman" w:hAnsi="Times New Roman" w:cs="Times New Roman"/>
+          <w:lang w:val="en-IN" w:eastAsia="en-IN"/>
+        </w:rPr>
+        <w:t xml:space="preserve"> easily.</w:t>
+      </w:r>
+    </w:p>
+    <w:p>
+      <w:pPr>
+        <w:numPr>
+          <w:ilvl w:val="0"/>
+          <w:numId w:val="3"/>
+        </w:numPr>
+        <w:spacing w:before="100" w:beforeAutospacing="1" w:after="100" w:afterAutospacing="1" w:line="240" w:lineRule="auto"/>
+        <w:rPr>
+          <w:rFonts w:ascii="Times New Roman" w:eastAsia="Times New Roman" w:hAnsi="Times New Roman" w:cs="Times New Roman"/>
+          <w:lang w:val="en-IN" w:eastAsia="en-IN"/>
+        </w:rPr>
+      </w:pPr>
+      <w:r>
+        <w:rPr>
+          <w:rFonts w:ascii="Times New Roman" w:eastAsia="Times New Roman" w:hAnsi="Times New Roman" w:cs="Times New Roman"/>
+          <w:lang w:val="en-IN" w:eastAsia="en-IN"/>
+        </w:rPr>
+        <w:t>Gives you access to useful methods and integrates well with TensorFlow workflows.</w:t>
+      </w:r>
+    </w:p>
+    <w:p>
+      <w:pPr>
+        <w:numPr>
+          <w:ilvl w:val="0"/>
+          <w:numId w:val="3"/>
+        </w:numPr>
+        <w:spacing w:before="100" w:beforeAutospacing="1" w:after="100" w:afterAutospacing="1" w:line="240" w:lineRule="auto"/>
+        <w:rPr>
+          <w:rFonts w:ascii="Times New Roman" w:eastAsia="Times New Roman" w:hAnsi="Times New Roman" w:cs="Times New Roman"/>
+          <w:lang w:val="en-IN" w:eastAsia="en-IN"/>
+        </w:rPr>
+      </w:pPr>
+      <w:r>
+        <w:rPr>
+          <w:rFonts w:ascii="Times New Roman" w:eastAsia="Times New Roman" w:hAnsi="Times New Roman" w:cs="Times New Roman"/>
+          <w:lang w:val="en-IN" w:eastAsia="en-IN"/>
+        </w:rPr>
+        <w:lastRenderedPageBreak/>
+        <w:t xml:space="preserve">Makes your PINN usable with TensorFlow training loops, </w:t>
+      </w:r>
+      <w:proofErr w:type="spellStart"/>
+      <w:r>
+        <w:rPr>
+          <w:rFonts w:ascii="Times New Roman" w:eastAsia="Times New Roman" w:hAnsi="Times New Roman" w:cs="Times New Roman"/>
+          <w:lang w:val="en-IN" w:eastAsia="en-IN"/>
+        </w:rPr>
+        <w:t>callbacks</w:t>
+      </w:r>
+      <w:proofErr w:type="spellEnd"/>
+      <w:r>
+        <w:rPr>
+          <w:rFonts w:ascii="Times New Roman" w:eastAsia="Times New Roman" w:hAnsi="Times New Roman" w:cs="Times New Roman"/>
+          <w:lang w:val="en-IN" w:eastAsia="en-IN"/>
+        </w:rPr>
+        <w:t>, and more.</w:t>
+      </w:r>
+    </w:p>
+    <w:p>
+      <w:pPr>
+        <w:rPr>
+          <w:lang w:val="en-DE"/>
+        </w:rPr>
+      </w:pPr>
+      <w:r>
+        <w:rPr>
+          <w:lang w:val="en-DE"/>
+        </w:rPr>
+        <w:t>Use of __</w:t>
+      </w:r>
+      <w:proofErr w:type="spellStart"/>
+      <w:r>
+        <w:rPr>
+          <w:lang w:val="en-DE"/>
+        </w:rPr>
+        <w:t>init</w:t>
+      </w:r>
+      <w:proofErr w:type="spellEnd"/>
+      <w:r>
+        <w:rPr>
+          <w:lang w:val="en-DE"/>
+        </w:rPr>
+        <w:t>__ and self</w:t>
+      </w:r>
+    </w:p>
+    <w:p>
+      <w:r>
+        <w:t>class Car:</w:t>
+      </w:r>
+    </w:p>
+    <w:p>
+      <w:r>
+        <w:t xml:space="preserve">    def __</w:t>
+      </w:r>
+      <w:proofErr w:type="spellStart"/>
+      <w:r>
+        <w:t>init</w:t>
+      </w:r>
+      <w:proofErr w:type="spellEnd"/>
+      <w:r>
+        <w:t>__(self, color):</w:t>
+      </w:r>
+    </w:p>
+    <w:p>
+      <w:r>
+        <w:t xml:space="preserve">        </w:t>
+      </w:r>
+      <w:proofErr w:type="spellStart"/>
+      <w:r>
+        <w:t>self.color</w:t>
+      </w:r>
+      <w:proofErr w:type="spellEnd"/>
+      <w:r>
+        <w:t xml:space="preserve"> = color</w:t>
+      </w:r>
+    </w:p>
+    <w:p/>
+    <w:p>
+      <w:proofErr w:type="spellStart"/>
+      <w:r>
+        <w:t>mycar</w:t>
+      </w:r>
+      <w:proofErr w:type="spellEnd"/>
+      <w:r>
+        <w:t xml:space="preserve"> = Car("red")</w:t>
+      </w:r>
+    </w:p>
+    <w:p>
+      <w:r>
+        <w:t>Here</w:t>
+      </w:r>
+    </w:p>
+    <w:p>
+      <w:proofErr w:type="spellStart"/>
+      <w:r>
+        <w:t>self.color</w:t>
+      </w:r>
+      <w:proofErr w:type="spellEnd"/>
+      <w:r>
+        <w:t xml:space="preserve"> = color stores "red" inside </w:t>
+      </w:r>
+      <w:proofErr w:type="spellStart"/>
+      <w:r>
+        <w:t>mycar</w:t>
+      </w:r>
+      <w:proofErr w:type="spellEnd"/>
+      <w:r>
+        <w:t>.</w:t>
+      </w:r>
+    </w:p>
+    <w:p>
+      <w:r>
+        <w:t xml:space="preserve">When you call </w:t>
+      </w:r>
+      <w:proofErr w:type="spellStart"/>
+      <w:r>
+        <w:t>mycar.color</w:t>
+      </w:r>
+      <w:proofErr w:type="spellEnd"/>
+      <w:r>
+        <w:t>, it will return "red".</w:t>
+      </w:r>
+    </w:p>
+    <w:p>
+      <w:pPr>
         <w:rPr>
           <w:lang w:val="en-DE"/>
         </w:rPr>
@@ -59,7 +554,6 @@
         <w:t>(</w:t>
       </w:r>
       <w:proofErr w:type="spellStart"/>
-      <w:proofErr w:type="gramStart"/>
       <w:r>
         <w:rPr>
           <w:rStyle w:val="katex-mathml"/>
@@ -67,7 +561,6 @@
         <w:t>x,t</w:t>
       </w:r>
       <w:proofErr w:type="spellEnd"/>
-      <w:proofErr w:type="gramEnd"/>
       <w:r>
         <w:rPr>
           <w:rStyle w:val="katex-mathml"/>
@@ -278,7 +771,6 @@
               </w:rPr>
             </w:pPr>
             <w:proofErr w:type="spellStart"/>
-            <w:proofErr w:type="gramStart"/>
             <w:r>
               <w:rPr>
                 <w:rFonts w:ascii="Courier New" w:eastAsia="Times New Roman" w:hAnsi="Courier New" w:cs="Courier New"/>
@@ -286,17 +778,7 @@
                 <w:szCs w:val="20"/>
                 <w:lang w:val="en-IN" w:eastAsia="en-IN"/>
               </w:rPr>
-              <w:t>tf.keras</w:t>
-            </w:r>
-            <w:proofErr w:type="gramEnd"/>
-            <w:r>
-              <w:rPr>
-                <w:rFonts w:ascii="Courier New" w:eastAsia="Times New Roman" w:hAnsi="Courier New" w:cs="Courier New"/>
-                <w:sz w:val="20"/>
-                <w:szCs w:val="20"/>
-                <w:lang w:val="en-IN" w:eastAsia="en-IN"/>
-              </w:rPr>
-              <w:t>.Model</w:t>
+              <w:t>tf.keras.Model</w:t>
             </w:r>
             <w:proofErr w:type="spellEnd"/>
           </w:p>
@@ -417,7 +899,6 @@
                 <w:lang w:val="en-IN" w:eastAsia="en-IN"/>
               </w:rPr>
             </w:pPr>
-            <w:proofErr w:type="gramStart"/>
             <w:r>
               <w:rPr>
                 <w:rFonts w:ascii="Courier New" w:eastAsia="Times New Roman" w:hAnsi="Courier New" w:cs="Courier New"/>
@@ -425,17 +906,7 @@
                 <w:szCs w:val="20"/>
                 <w:lang w:val="en-IN" w:eastAsia="en-IN"/>
               </w:rPr>
-              <w:t>call(</w:t>
-            </w:r>
-            <w:proofErr w:type="gramEnd"/>
-            <w:r>
-              <w:rPr>
-                <w:rFonts w:ascii="Courier New" w:eastAsia="Times New Roman" w:hAnsi="Courier New" w:cs="Courier New"/>
-                <w:sz w:val="20"/>
-                <w:szCs w:val="20"/>
-                <w:lang w:val="en-IN" w:eastAsia="en-IN"/>
-              </w:rPr>
-              <w:t>)</w:t>
+              <w:t>call()</w:t>
             </w:r>
           </w:p>
         </w:tc>
@@ -533,6 +1004,7 @@
       </w:pPr>
       <w:r>
         <w:rPr>
+          <w:noProof/>
           <w:lang w:val="en-DE"/>
         </w:rPr>
         <w:drawing>
@@ -559,7 +1031,7 @@
                     <pic:cNvPicPr/>
                   </pic:nvPicPr>
                   <pic:blipFill>
-                    <a:blip r:embed="rId5" cstate="print">
+                    <a:blip r:embed="rId7" cstate="print">
                       <a:extLst>
                         <a:ext uri="{28A0092B-C50C-407E-A947-70E740481C1C}">
                           <a14:useLocalDpi xmlns:a14="http://schemas.microsoft.com/office/drawing/2010/main" val="0"/>
@@ -702,6 +1174,471 @@
         </w:rPr>
       </w:pPr>
     </w:p>
+    <w:p>
+      <w:pPr>
+        <w:rPr>
+          <w:lang w:val="en-DE"/>
+        </w:rPr>
+      </w:pPr>
+    </w:p>
+    <w:p>
+      <w:pPr>
+        <w:rPr>
+          <w:lang w:val="en-DE"/>
+        </w:rPr>
+      </w:pPr>
+    </w:p>
+    <w:p>
+      <w:r>
+        <w:rPr>
+          <w:lang w:val="en-DE"/>
+        </w:rPr>
+        <w:t>Function :</w:t>
+      </w:r>
+      <w:r>
+        <w:t xml:space="preserve"> </w:t>
+      </w:r>
+      <w:proofErr w:type="spellStart"/>
+      <w:r>
+        <w:t>compute_pde_residual</w:t>
+      </w:r>
+      <w:proofErr w:type="spellEnd"/>
+      <w:r>
+        <w:t>(self, X)</w:t>
+      </w:r>
+    </w:p>
+    <w:p>
+      <w:pPr>
+        <w:rPr>
+          <w:lang w:val="en-DE"/>
+        </w:rPr>
+      </w:pPr>
+      <w:r>
+        <w:rPr>
+          <w:lang w:val="en-DE"/>
+        </w:rPr>
+        <w:t>To compute the residuals from each interior points:</w:t>
+      </w:r>
+      <w:r>
+        <w:t xml:space="preserve"> </w:t>
+      </w:r>
+      <w:r>
+        <w:t>to compute the PDE residual for the heat equation:</w:t>
+      </w:r>
+      <w:r>
+        <w:rPr>
+          <w:lang w:val="en-DE"/>
+        </w:rPr>
+        <w:t xml:space="preserve"> or any other </w:t>
+      </w:r>
+      <w:proofErr w:type="spellStart"/>
+      <w:r>
+        <w:rPr>
+          <w:lang w:val="en-DE"/>
+        </w:rPr>
+        <w:t>PDEs</w:t>
+      </w:r>
+      <w:proofErr w:type="spellEnd"/>
+      <w:r>
+        <w:rPr>
+          <w:lang w:val="en-DE"/>
+        </w:rPr>
+        <w:t xml:space="preserve">. </w:t>
+      </w:r>
+    </w:p>
+    <w:p>
+      <w:pPr>
+        <w:rPr>
+          <w:lang w:val="en-DE"/>
+        </w:rPr>
+      </w:pPr>
+      <w:r>
+        <w:rPr>
+          <w:lang w:val="en-DE"/>
+        </w:rPr>
+        <w:drawing>
+          <wp:inline distT="0" distB="0" distL="0" distR="0" wp14:anchorId="686AD758" wp14:editId="65D43A3C">
+            <wp:extent cx="1539373" cy="556308"/>
+            <wp:effectExtent l="0" t="0" r="3810" b="0"/>
+            <wp:docPr id="4" name="Picture 4" descr="A black text on a white background&#10;&#10;Description automatically generated"/>
+            <wp:cNvGraphicFramePr>
+              <a:graphicFrameLocks xmlns:a="http://schemas.openxmlformats.org/drawingml/2006/main" noChangeAspect="1"/>
+            </wp:cNvGraphicFramePr>
+            <a:graphic xmlns:a="http://schemas.openxmlformats.org/drawingml/2006/main">
+              <a:graphicData uri="http://schemas.openxmlformats.org/drawingml/2006/picture">
+                <pic:pic xmlns:pic="http://schemas.openxmlformats.org/drawingml/2006/picture">
+                  <pic:nvPicPr>
+                    <pic:cNvPr id="4" name="Picture 4" descr="A black text on a white background&#10;&#10;Description automatically generated"/>
+                    <pic:cNvPicPr/>
+                  </pic:nvPicPr>
+                  <pic:blipFill>
+                    <a:blip r:embed="rId8"/>
+                    <a:stretch>
+                      <a:fillRect/>
+                    </a:stretch>
+                  </pic:blipFill>
+                  <pic:spPr>
+                    <a:xfrm>
+                      <a:off x="0" y="0"/>
+                      <a:ext cx="1539373" cy="556308"/>
+                    </a:xfrm>
+                    <a:prstGeom prst="rect">
+                      <a:avLst/>
+                    </a:prstGeom>
+                  </pic:spPr>
+                </pic:pic>
+              </a:graphicData>
+            </a:graphic>
+          </wp:inline>
+        </w:drawing>
+      </w:r>
+      <w:r>
+        <w:rPr>
+          <w:lang w:val="en-DE"/>
+        </w:rPr>
+        <w:t xml:space="preserve">this is the residual for each point. </w:t>
+      </w:r>
+    </w:p>
+    <w:p>
+      <w:pPr>
+        <w:pStyle w:val="Heading2"/>
+      </w:pPr>
+      <w:r>
+        <w:lastRenderedPageBreak/>
+        <w:t>1. Purpose</w:t>
+      </w:r>
+    </w:p>
+    <w:p>
+      <w:pPr>
+        <w:pStyle w:val="NormalWeb"/>
+        <w:numPr>
+          <w:ilvl w:val="0"/>
+          <w:numId w:val="4"/>
+        </w:numPr>
+      </w:pPr>
+      <w:r>
+        <w:t xml:space="preserve">Compute </w:t>
+      </w:r>
+      <w:r>
+        <w:rPr>
+          <w:rStyle w:val="katex-mathml"/>
+        </w:rPr>
+        <w:t>u(</w:t>
+      </w:r>
+      <w:proofErr w:type="spellStart"/>
+      <w:r>
+        <w:rPr>
+          <w:rStyle w:val="katex-mathml"/>
+        </w:rPr>
+        <w:t>x,t</w:t>
+      </w:r>
+      <w:proofErr w:type="spellEnd"/>
+      <w:r>
+        <w:rPr>
+          <w:rStyle w:val="katex-mathml"/>
+        </w:rPr>
+        <w:t>)u(</w:t>
+      </w:r>
+      <w:proofErr w:type="spellStart"/>
+      <w:r>
+        <w:rPr>
+          <w:rStyle w:val="katex-mathml"/>
+        </w:rPr>
+        <w:t>x,t</w:t>
+      </w:r>
+      <w:proofErr w:type="spellEnd"/>
+      <w:r>
+        <w:rPr>
+          <w:rStyle w:val="katex-mathml"/>
+        </w:rPr>
+        <w:t>)</w:t>
+      </w:r>
+      <w:r>
+        <w:rPr>
+          <w:rStyle w:val="mord"/>
+        </w:rPr>
+        <w:t>u</w:t>
+      </w:r>
+      <w:r>
+        <w:rPr>
+          <w:rStyle w:val="mopen"/>
+        </w:rPr>
+        <w:t>(</w:t>
+      </w:r>
+      <w:proofErr w:type="spellStart"/>
+      <w:r>
+        <w:rPr>
+          <w:rStyle w:val="mord"/>
+        </w:rPr>
+        <w:t>x</w:t>
+      </w:r>
+      <w:r>
+        <w:rPr>
+          <w:rStyle w:val="mpunct"/>
+        </w:rPr>
+        <w:t>,</w:t>
+      </w:r>
+      <w:r>
+        <w:rPr>
+          <w:rStyle w:val="mord"/>
+        </w:rPr>
+        <w:t>t</w:t>
+      </w:r>
+      <w:proofErr w:type="spellEnd"/>
+      <w:r>
+        <w:rPr>
+          <w:rStyle w:val="mclose"/>
+        </w:rPr>
+        <w:t>)</w:t>
+      </w:r>
+      <w:r>
+        <w:t xml:space="preserve"> from the model.</w:t>
+      </w:r>
+    </w:p>
+    <w:p>
+      <w:pPr>
+        <w:pStyle w:val="NormalWeb"/>
+        <w:numPr>
+          <w:ilvl w:val="0"/>
+          <w:numId w:val="4"/>
+        </w:numPr>
+      </w:pPr>
+      <w:r>
+        <w:t xml:space="preserve">Calculate derivatives </w:t>
+      </w:r>
+      <w:r>
+        <w:rPr>
+          <w:rStyle w:val="katex-mathml"/>
+        </w:rPr>
+        <w:t xml:space="preserve">∂u/∂t\partial u / \partial </w:t>
+      </w:r>
+      <w:proofErr w:type="spellStart"/>
+      <w:r>
+        <w:rPr>
+          <w:rStyle w:val="katex-mathml"/>
+        </w:rPr>
+        <w:t>t</w:t>
+      </w:r>
+      <w:r>
+        <w:rPr>
+          <w:rStyle w:val="mord"/>
+        </w:rPr>
+        <w:t>∂u</w:t>
+      </w:r>
+      <w:proofErr w:type="spellEnd"/>
+      <w:r>
+        <w:rPr>
+          <w:rStyle w:val="mord"/>
+        </w:rPr>
+        <w:t>/∂t</w:t>
+      </w:r>
+      <w:r>
+        <w:t xml:space="preserve"> and </w:t>
+      </w:r>
+      <w:r>
+        <w:rPr>
+          <w:rStyle w:val="katex-mathml"/>
+        </w:rPr>
+        <w:t>∂2u/∂x2\partial^2 u / \partial x^2</w:t>
+      </w:r>
+      <w:r>
+        <w:rPr>
+          <w:rStyle w:val="mord"/>
+        </w:rPr>
+        <w:t>∂2u/∂x2</w:t>
+      </w:r>
+      <w:r>
+        <w:t>.</w:t>
+      </w:r>
+    </w:p>
+    <w:p>
+      <w:pPr>
+        <w:pStyle w:val="NormalWeb"/>
+        <w:numPr>
+          <w:ilvl w:val="0"/>
+          <w:numId w:val="4"/>
+        </w:numPr>
+      </w:pPr>
+      <w:r>
+        <w:t xml:space="preserve">Return residual </w:t>
+      </w:r>
+      <w:r>
+        <w:rPr>
+          <w:rStyle w:val="katex-mathml"/>
+        </w:rPr>
+        <w:t>f=</w:t>
+      </w:r>
+      <w:proofErr w:type="spellStart"/>
+      <w:r>
+        <w:rPr>
+          <w:rStyle w:val="katex-mathml"/>
+        </w:rPr>
+        <w:t>ut−uxxf</w:t>
+      </w:r>
+      <w:proofErr w:type="spellEnd"/>
+      <w:r>
+        <w:rPr>
+          <w:rStyle w:val="katex-mathml"/>
+        </w:rPr>
+        <w:t xml:space="preserve"> = </w:t>
+      </w:r>
+      <w:proofErr w:type="spellStart"/>
+      <w:r>
+        <w:rPr>
+          <w:rStyle w:val="katex-mathml"/>
+        </w:rPr>
+        <w:t>u_t</w:t>
+      </w:r>
+      <w:proofErr w:type="spellEnd"/>
+      <w:r>
+        <w:rPr>
+          <w:rStyle w:val="katex-mathml"/>
+        </w:rPr>
+        <w:t xml:space="preserve"> - u_{xx}</w:t>
+      </w:r>
+      <w:r>
+        <w:rPr>
+          <w:rStyle w:val="mord"/>
+        </w:rPr>
+        <w:t>f</w:t>
+      </w:r>
+      <w:r>
+        <w:rPr>
+          <w:rStyle w:val="mrel"/>
+        </w:rPr>
+        <w:t>=</w:t>
+      </w:r>
+      <w:proofErr w:type="spellStart"/>
+      <w:r>
+        <w:rPr>
+          <w:rStyle w:val="mord"/>
+        </w:rPr>
+        <w:t>ut</w:t>
+      </w:r>
+      <w:proofErr w:type="spellEnd"/>
+      <w:r>
+        <w:rPr>
+          <w:rStyle w:val="vlist-s"/>
+        </w:rPr>
+        <w:t>​</w:t>
+      </w:r>
+      <w:r>
+        <w:rPr>
+          <w:rStyle w:val="mbin"/>
+        </w:rPr>
+        <w:t>−</w:t>
+      </w:r>
+      <w:proofErr w:type="spellStart"/>
+      <w:r>
+        <w:rPr>
+          <w:rStyle w:val="mord"/>
+        </w:rPr>
+        <w:t>uxx</w:t>
+      </w:r>
+      <w:proofErr w:type="spellEnd"/>
+      <w:r>
+        <w:rPr>
+          <w:rStyle w:val="vlist-s"/>
+        </w:rPr>
+        <w:t>​</w:t>
+      </w:r>
+      <w:r>
+        <w:t>, which ideally should be zero if the PDE is satisfied.</w:t>
+      </w:r>
+    </w:p>
+    <w:p>
+      <w:pPr>
+        <w:rPr>
+          <w:lang w:val="en-DE"/>
+        </w:rPr>
+      </w:pPr>
+    </w:p>
+    <w:p>
+      <w:pPr>
+        <w:rPr>
+          <w:lang w:val="en-DE"/>
+        </w:rPr>
+      </w:pPr>
+      <w:r>
+        <w:rPr>
+          <w:lang w:val="en-DE"/>
+        </w:rPr>
+        <w:t>What is tape in Tensor flow and what does it do ?</w:t>
+      </w:r>
+    </w:p>
+    <w:p>
+      <w:pPr>
+        <w:rPr>
+          <w:lang w:val="en-DE"/>
+        </w:rPr>
+      </w:pPr>
+      <w:r>
+        <w:t xml:space="preserve">TensorFlow records math ops on the tape, then uses </w:t>
+      </w:r>
+      <w:r>
+        <w:rPr>
+          <w:rStyle w:val="Strong"/>
+        </w:rPr>
+        <w:t>chain rule</w:t>
+      </w:r>
+      <w:r>
+        <w:t xml:space="preserve"> to compute gradients by replaying those steps backward</w:t>
+      </w:r>
+      <w:r>
+        <w:rPr>
+          <w:lang w:val="en-DE"/>
+        </w:rPr>
+        <w:t xml:space="preserve">. </w:t>
+      </w:r>
+    </w:p>
+    <w:p>
+      <w:pPr>
+        <w:rPr>
+          <w:lang w:val="en-DE"/>
+        </w:rPr>
+      </w:pPr>
+    </w:p>
+    <w:p>
+      <w:pPr>
+        <w:rPr>
+          <w:lang w:val="en-DE"/>
+        </w:rPr>
+      </w:pPr>
+      <w:r>
+        <w:rPr>
+          <w:lang w:val="en-DE"/>
+        </w:rPr>
+        <w:t xml:space="preserve">We are using two tapes , idea is we need to calculate two differentiation ,first and second </w:t>
+      </w:r>
+      <w:proofErr w:type="spellStart"/>
+      <w:r>
+        <w:rPr>
+          <w:lang w:val="en-DE"/>
+        </w:rPr>
+        <w:t>derviate</w:t>
+      </w:r>
+      <w:proofErr w:type="spellEnd"/>
+      <w:r>
+        <w:rPr>
+          <w:lang w:val="en-DE"/>
+        </w:rPr>
+        <w:t xml:space="preserve"> </w:t>
+      </w:r>
+      <w:proofErr w:type="spellStart"/>
+      <w:r>
+        <w:rPr>
+          <w:lang w:val="en-DE"/>
+        </w:rPr>
+        <w:t>wrt</w:t>
+      </w:r>
+      <w:proofErr w:type="spellEnd"/>
+      <w:r>
+        <w:rPr>
+          <w:lang w:val="en-DE"/>
+        </w:rPr>
+        <w:t xml:space="preserve"> to x, . Tapes are useful more in gradients . </w:t>
+      </w:r>
+    </w:p>
     <w:sectPr>
       <w:pgSz w:w="11906" w:h="16838"/>
       <w:pgMar w:top="1440" w:right="1440" w:bottom="1440" w:left="1440" w:header="708" w:footer="708" w:gutter="0"/>
@@ -715,6 +1652,304 @@
 <file path=word/numbering.xml><?xml version="1.0" encoding="utf-8"?>
 <w:numbering xmlns:wpc="http://schemas.microsoft.com/office/word/2010/wordprocessingCanvas" xmlns:cx="http://schemas.microsoft.com/office/drawing/2014/chartex" xmlns:cx1="http://schemas.microsoft.com/office/drawing/2015/9/8/chartex" xmlns:cx2="http://schemas.microsoft.com/office/drawing/2015/10/21/chartex" xmlns:cx3="http://schemas.microsoft.com/office/drawing/2016/5/9/chartex" xmlns:cx4="http://schemas.microsoft.com/office/drawing/2016/5/10/chartex" xmlns:cx5="http://schemas.microsoft.com/office/drawing/2016/5/11/chartex" xmlns:cx6="http://schemas.microsoft.com/office/drawing/2016/5/12/chartex" xmlns:cx7="http://schemas.microsoft.com/office/drawing/2016/5/13/chartex" xmlns:cx8="http://schemas.microsoft.com/office/drawing/2016/5/14/chartex" xmlns:mc="http://schemas.openxmlformats.org/markup-compatibility/2006" xmlns:aink="http://schemas.microsoft.com/office/drawing/2016/ink" xmlns:am3d="http://schemas.microsoft.com/office/drawing/2017/model3d" xmlns:o="urn:schemas-microsoft-com:office:office" xmlns:oel="http://schemas.microsoft.com/office/2019/extlst" xmlns:r="http://schemas.openxmlformats.org/officeDocument/2006/relationships" xmlns:m="http://schemas.openxmlformats.org/officeDocument/2006/math" xmlns:v="urn:schemas-microsoft-com:vml" xmlns:wp14="http://schemas.microsoft.com/office/word/2010/wordprocessingDrawing" xmlns:wp="http://schemas.openxmlformats.org/drawingml/2006/wordprocessingDrawing" xmlns:w10="urn:schemas-microsoft-com:office:word" xmlns:w="http://schemas.openxmlformats.org/wordprocessingml/2006/main" xmlns:w14="http://schemas.microsoft.com/office/word/2010/wordml" xmlns:w15="http://schemas.microsoft.com/office/word/2012/wordml" xmlns:w16cex="http://schemas.microsoft.com/office/word/2018/wordml/cex" xmlns:w16cid="http://schemas.microsoft.com/office/word/2016/wordml/cid" xmlns:w16="http://schemas.microsoft.com/office/word/2018/wordml" xmlns:w16sdtdh="http://schemas.microsoft.com/office/word/2020/wordml/sdtdatahash" xmlns:w16se="http://schemas.microsoft.com/office/word/2015/wordml/symex" xmlns:wpg="http://schemas.microsoft.com/office/word/2010/wordprocessingGroup" xmlns:wpi="http://schemas.microsoft.com/office/word/2010/wordprocessingInk" xmlns:wne="http://schemas.microsoft.com/office/word/2006/wordml" xmlns:wps="http://schemas.microsoft.com/office/word/2010/wordprocessingShape" mc:Ignorable="w14 w15 w16se w16cid w16 w16cex w16sdtdh wp14">
   <w:abstractNum w:abstractNumId="0" w15:restartNumberingAfterBreak="0">
+    <w:nsid w:val="0522177F"/>
+    <w:multiLevelType w:val="multilevel"/>
+    <w:tmpl w:val="3828A7B4"/>
+    <w:lvl w:ilvl="0">
+      <w:start w:val="1"/>
+      <w:numFmt w:val="bullet"/>
+      <w:lvlText w:val=""/>
+      <w:lvlJc w:val="left"/>
+      <w:pPr>
+        <w:tabs>
+          <w:tab w:val="num" w:pos="720"/>
+        </w:tabs>
+        <w:ind w:left="720" w:hanging="360"/>
+      </w:pPr>
+      <w:rPr>
+        <w:rFonts w:ascii="Symbol" w:hAnsi="Symbol" w:hint="default"/>
+        <w:sz w:val="20"/>
+      </w:rPr>
+    </w:lvl>
+    <w:lvl w:ilvl="1" w:tentative="1">
+      <w:start w:val="1"/>
+      <w:numFmt w:val="bullet"/>
+      <w:lvlText w:val="o"/>
+      <w:lvlJc w:val="left"/>
+      <w:pPr>
+        <w:tabs>
+          <w:tab w:val="num" w:pos="1440"/>
+        </w:tabs>
+        <w:ind w:left="1440" w:hanging="360"/>
+      </w:pPr>
+      <w:rPr>
+        <w:rFonts w:ascii="Courier New" w:hAnsi="Courier New" w:hint="default"/>
+        <w:sz w:val="20"/>
+      </w:rPr>
+    </w:lvl>
+    <w:lvl w:ilvl="2" w:tentative="1">
+      <w:start w:val="1"/>
+      <w:numFmt w:val="bullet"/>
+      <w:lvlText w:val=""/>
+      <w:lvlJc w:val="left"/>
+      <w:pPr>
+        <w:tabs>
+          <w:tab w:val="num" w:pos="2160"/>
+        </w:tabs>
+        <w:ind w:left="2160" w:hanging="360"/>
+      </w:pPr>
+      <w:rPr>
+        <w:rFonts w:ascii="Wingdings" w:hAnsi="Wingdings" w:hint="default"/>
+        <w:sz w:val="20"/>
+      </w:rPr>
+    </w:lvl>
+    <w:lvl w:ilvl="3" w:tentative="1">
+      <w:start w:val="1"/>
+      <w:numFmt w:val="bullet"/>
+      <w:lvlText w:val=""/>
+      <w:lvlJc w:val="left"/>
+      <w:pPr>
+        <w:tabs>
+          <w:tab w:val="num" w:pos="2880"/>
+        </w:tabs>
+        <w:ind w:left="2880" w:hanging="360"/>
+      </w:pPr>
+      <w:rPr>
+        <w:rFonts w:ascii="Wingdings" w:hAnsi="Wingdings" w:hint="default"/>
+        <w:sz w:val="20"/>
+      </w:rPr>
+    </w:lvl>
+    <w:lvl w:ilvl="4" w:tentative="1">
+      <w:start w:val="1"/>
+      <w:numFmt w:val="bullet"/>
+      <w:lvlText w:val=""/>
+      <w:lvlJc w:val="left"/>
+      <w:pPr>
+        <w:tabs>
+          <w:tab w:val="num" w:pos="3600"/>
+        </w:tabs>
+        <w:ind w:left="3600" w:hanging="360"/>
+      </w:pPr>
+      <w:rPr>
+        <w:rFonts w:ascii="Wingdings" w:hAnsi="Wingdings" w:hint="default"/>
+        <w:sz w:val="20"/>
+      </w:rPr>
+    </w:lvl>
+    <w:lvl w:ilvl="5" w:tentative="1">
+      <w:start w:val="1"/>
+      <w:numFmt w:val="bullet"/>
+      <w:lvlText w:val=""/>
+      <w:lvlJc w:val="left"/>
+      <w:pPr>
+        <w:tabs>
+          <w:tab w:val="num" w:pos="4320"/>
+        </w:tabs>
+        <w:ind w:left="4320" w:hanging="360"/>
+      </w:pPr>
+      <w:rPr>
+        <w:rFonts w:ascii="Wingdings" w:hAnsi="Wingdings" w:hint="default"/>
+        <w:sz w:val="20"/>
+      </w:rPr>
+    </w:lvl>
+    <w:lvl w:ilvl="6" w:tentative="1">
+      <w:start w:val="1"/>
+      <w:numFmt w:val="bullet"/>
+      <w:lvlText w:val=""/>
+      <w:lvlJc w:val="left"/>
+      <w:pPr>
+        <w:tabs>
+          <w:tab w:val="num" w:pos="5040"/>
+        </w:tabs>
+        <w:ind w:left="5040" w:hanging="360"/>
+      </w:pPr>
+      <w:rPr>
+        <w:rFonts w:ascii="Wingdings" w:hAnsi="Wingdings" w:hint="default"/>
+        <w:sz w:val="20"/>
+      </w:rPr>
+    </w:lvl>
+    <w:lvl w:ilvl="7" w:tentative="1">
+      <w:start w:val="1"/>
+      <w:numFmt w:val="bullet"/>
+      <w:lvlText w:val=""/>
+      <w:lvlJc w:val="left"/>
+      <w:pPr>
+        <w:tabs>
+          <w:tab w:val="num" w:pos="5760"/>
+        </w:tabs>
+        <w:ind w:left="5760" w:hanging="360"/>
+      </w:pPr>
+      <w:rPr>
+        <w:rFonts w:ascii="Wingdings" w:hAnsi="Wingdings" w:hint="default"/>
+        <w:sz w:val="20"/>
+      </w:rPr>
+    </w:lvl>
+    <w:lvl w:ilvl="8" w:tentative="1">
+      <w:start w:val="1"/>
+      <w:numFmt w:val="bullet"/>
+      <w:lvlText w:val=""/>
+      <w:lvlJc w:val="left"/>
+      <w:pPr>
+        <w:tabs>
+          <w:tab w:val="num" w:pos="6480"/>
+        </w:tabs>
+        <w:ind w:left="6480" w:hanging="360"/>
+      </w:pPr>
+      <w:rPr>
+        <w:rFonts w:ascii="Wingdings" w:hAnsi="Wingdings" w:hint="default"/>
+        <w:sz w:val="20"/>
+      </w:rPr>
+    </w:lvl>
+  </w:abstractNum>
+  <w:abstractNum w:abstractNumId="1" w15:restartNumberingAfterBreak="0">
+    <w:nsid w:val="0E4778D6"/>
+    <w:multiLevelType w:val="multilevel"/>
+    <w:tmpl w:val="DD5EDAD8"/>
+    <w:lvl w:ilvl="0">
+      <w:start w:val="1"/>
+      <w:numFmt w:val="bullet"/>
+      <w:lvlText w:val=""/>
+      <w:lvlJc w:val="left"/>
+      <w:pPr>
+        <w:tabs>
+          <w:tab w:val="num" w:pos="720"/>
+        </w:tabs>
+        <w:ind w:left="720" w:hanging="360"/>
+      </w:pPr>
+      <w:rPr>
+        <w:rFonts w:ascii="Symbol" w:hAnsi="Symbol" w:hint="default"/>
+        <w:sz w:val="20"/>
+      </w:rPr>
+    </w:lvl>
+    <w:lvl w:ilvl="1" w:tentative="1">
+      <w:start w:val="1"/>
+      <w:numFmt w:val="bullet"/>
+      <w:lvlText w:val="o"/>
+      <w:lvlJc w:val="left"/>
+      <w:pPr>
+        <w:tabs>
+          <w:tab w:val="num" w:pos="1440"/>
+        </w:tabs>
+        <w:ind w:left="1440" w:hanging="360"/>
+      </w:pPr>
+      <w:rPr>
+        <w:rFonts w:ascii="Courier New" w:hAnsi="Courier New" w:hint="default"/>
+        <w:sz w:val="20"/>
+      </w:rPr>
+    </w:lvl>
+    <w:lvl w:ilvl="2" w:tentative="1">
+      <w:start w:val="1"/>
+      <w:numFmt w:val="bullet"/>
+      <w:lvlText w:val=""/>
+      <w:lvlJc w:val="left"/>
+      <w:pPr>
+        <w:tabs>
+          <w:tab w:val="num" w:pos="2160"/>
+        </w:tabs>
+        <w:ind w:left="2160" w:hanging="360"/>
+      </w:pPr>
+      <w:rPr>
+        <w:rFonts w:ascii="Wingdings" w:hAnsi="Wingdings" w:hint="default"/>
+        <w:sz w:val="20"/>
+      </w:rPr>
+    </w:lvl>
+    <w:lvl w:ilvl="3" w:tentative="1">
+      <w:start w:val="1"/>
+      <w:numFmt w:val="bullet"/>
+      <w:lvlText w:val=""/>
+      <w:lvlJc w:val="left"/>
+      <w:pPr>
+        <w:tabs>
+          <w:tab w:val="num" w:pos="2880"/>
+        </w:tabs>
+        <w:ind w:left="2880" w:hanging="360"/>
+      </w:pPr>
+      <w:rPr>
+        <w:rFonts w:ascii="Wingdings" w:hAnsi="Wingdings" w:hint="default"/>
+        <w:sz w:val="20"/>
+      </w:rPr>
+    </w:lvl>
+    <w:lvl w:ilvl="4" w:tentative="1">
+      <w:start w:val="1"/>
+      <w:numFmt w:val="bullet"/>
+      <w:lvlText w:val=""/>
+      <w:lvlJc w:val="left"/>
+      <w:pPr>
+        <w:tabs>
+          <w:tab w:val="num" w:pos="3600"/>
+        </w:tabs>
+        <w:ind w:left="3600" w:hanging="360"/>
+      </w:pPr>
+      <w:rPr>
+        <w:rFonts w:ascii="Wingdings" w:hAnsi="Wingdings" w:hint="default"/>
+        <w:sz w:val="20"/>
+      </w:rPr>
+    </w:lvl>
+    <w:lvl w:ilvl="5" w:tentative="1">
+      <w:start w:val="1"/>
+      <w:numFmt w:val="bullet"/>
+      <w:lvlText w:val=""/>
+      <w:lvlJc w:val="left"/>
+      <w:pPr>
+        <w:tabs>
+          <w:tab w:val="num" w:pos="4320"/>
+        </w:tabs>
+        <w:ind w:left="4320" w:hanging="360"/>
+      </w:pPr>
+      <w:rPr>
+        <w:rFonts w:ascii="Wingdings" w:hAnsi="Wingdings" w:hint="default"/>
+        <w:sz w:val="20"/>
+      </w:rPr>
+    </w:lvl>
+    <w:lvl w:ilvl="6" w:tentative="1">
+      <w:start w:val="1"/>
+      <w:numFmt w:val="bullet"/>
+      <w:lvlText w:val=""/>
+      <w:lvlJc w:val="left"/>
+      <w:pPr>
+        <w:tabs>
+          <w:tab w:val="num" w:pos="5040"/>
+        </w:tabs>
+        <w:ind w:left="5040" w:hanging="360"/>
+      </w:pPr>
+      <w:rPr>
+        <w:rFonts w:ascii="Wingdings" w:hAnsi="Wingdings" w:hint="default"/>
+        <w:sz w:val="20"/>
+      </w:rPr>
+    </w:lvl>
+    <w:lvl w:ilvl="7" w:tentative="1">
+      <w:start w:val="1"/>
+      <w:numFmt w:val="bullet"/>
+      <w:lvlText w:val=""/>
+      <w:lvlJc w:val="left"/>
+      <w:pPr>
+        <w:tabs>
+          <w:tab w:val="num" w:pos="5760"/>
+        </w:tabs>
+        <w:ind w:left="5760" w:hanging="360"/>
+      </w:pPr>
+      <w:rPr>
+        <w:rFonts w:ascii="Wingdings" w:hAnsi="Wingdings" w:hint="default"/>
+        <w:sz w:val="20"/>
+      </w:rPr>
+    </w:lvl>
+    <w:lvl w:ilvl="8" w:tentative="1">
+      <w:start w:val="1"/>
+      <w:numFmt w:val="bullet"/>
+      <w:lvlText w:val=""/>
+      <w:lvlJc w:val="left"/>
+      <w:pPr>
+        <w:tabs>
+          <w:tab w:val="num" w:pos="6480"/>
+        </w:tabs>
+        <w:ind w:left="6480" w:hanging="360"/>
+      </w:pPr>
+      <w:rPr>
+        <w:rFonts w:ascii="Wingdings" w:hAnsi="Wingdings" w:hint="default"/>
+        <w:sz w:val="20"/>
+      </w:rPr>
+    </w:lvl>
+  </w:abstractNum>
+  <w:abstractNum w:abstractNumId="2" w15:restartNumberingAfterBreak="0">
     <w:nsid w:val="3B655CD7"/>
     <w:multiLevelType w:val="multilevel"/>
     <w:tmpl w:val="CFD6CF1E"/>
@@ -863,8 +2098,166 @@
       </w:rPr>
     </w:lvl>
   </w:abstractNum>
+  <w:abstractNum w:abstractNumId="3" w15:restartNumberingAfterBreak="0">
+    <w:nsid w:val="6384158F"/>
+    <w:multiLevelType w:val="multilevel"/>
+    <w:tmpl w:val="ACF6E2DA"/>
+    <w:lvl w:ilvl="0">
+      <w:start w:val="1"/>
+      <w:numFmt w:val="bullet"/>
+      <w:lvlText w:val=""/>
+      <w:lvlJc w:val="left"/>
+      <w:pPr>
+        <w:tabs>
+          <w:tab w:val="num" w:pos="720"/>
+        </w:tabs>
+        <w:ind w:left="720" w:hanging="360"/>
+      </w:pPr>
+      <w:rPr>
+        <w:rFonts w:ascii="Symbol" w:hAnsi="Symbol" w:hint="default"/>
+        <w:sz w:val="20"/>
+      </w:rPr>
+    </w:lvl>
+    <w:lvl w:ilvl="1" w:tentative="1">
+      <w:start w:val="1"/>
+      <w:numFmt w:val="bullet"/>
+      <w:lvlText w:val="o"/>
+      <w:lvlJc w:val="left"/>
+      <w:pPr>
+        <w:tabs>
+          <w:tab w:val="num" w:pos="1440"/>
+        </w:tabs>
+        <w:ind w:left="1440" w:hanging="360"/>
+      </w:pPr>
+      <w:rPr>
+        <w:rFonts w:ascii="Courier New" w:hAnsi="Courier New" w:hint="default"/>
+        <w:sz w:val="20"/>
+      </w:rPr>
+    </w:lvl>
+    <w:lvl w:ilvl="2" w:tentative="1">
+      <w:start w:val="1"/>
+      <w:numFmt w:val="bullet"/>
+      <w:lvlText w:val=""/>
+      <w:lvlJc w:val="left"/>
+      <w:pPr>
+        <w:tabs>
+          <w:tab w:val="num" w:pos="2160"/>
+        </w:tabs>
+        <w:ind w:left="2160" w:hanging="360"/>
+      </w:pPr>
+      <w:rPr>
+        <w:rFonts w:ascii="Wingdings" w:hAnsi="Wingdings" w:hint="default"/>
+        <w:sz w:val="20"/>
+      </w:rPr>
+    </w:lvl>
+    <w:lvl w:ilvl="3" w:tentative="1">
+      <w:start w:val="1"/>
+      <w:numFmt w:val="bullet"/>
+      <w:lvlText w:val=""/>
+      <w:lvlJc w:val="left"/>
+      <w:pPr>
+        <w:tabs>
+          <w:tab w:val="num" w:pos="2880"/>
+        </w:tabs>
+        <w:ind w:left="2880" w:hanging="360"/>
+      </w:pPr>
+      <w:rPr>
+        <w:rFonts w:ascii="Wingdings" w:hAnsi="Wingdings" w:hint="default"/>
+        <w:sz w:val="20"/>
+      </w:rPr>
+    </w:lvl>
+    <w:lvl w:ilvl="4" w:tentative="1">
+      <w:start w:val="1"/>
+      <w:numFmt w:val="bullet"/>
+      <w:lvlText w:val=""/>
+      <w:lvlJc w:val="left"/>
+      <w:pPr>
+        <w:tabs>
+          <w:tab w:val="num" w:pos="3600"/>
+        </w:tabs>
+        <w:ind w:left="3600" w:hanging="360"/>
+      </w:pPr>
+      <w:rPr>
+        <w:rFonts w:ascii="Wingdings" w:hAnsi="Wingdings" w:hint="default"/>
+        <w:sz w:val="20"/>
+      </w:rPr>
+    </w:lvl>
+    <w:lvl w:ilvl="5" w:tentative="1">
+      <w:start w:val="1"/>
+      <w:numFmt w:val="bullet"/>
+      <w:lvlText w:val=""/>
+      <w:lvlJc w:val="left"/>
+      <w:pPr>
+        <w:tabs>
+          <w:tab w:val="num" w:pos="4320"/>
+        </w:tabs>
+        <w:ind w:left="4320" w:hanging="360"/>
+      </w:pPr>
+      <w:rPr>
+        <w:rFonts w:ascii="Wingdings" w:hAnsi="Wingdings" w:hint="default"/>
+        <w:sz w:val="20"/>
+      </w:rPr>
+    </w:lvl>
+    <w:lvl w:ilvl="6" w:tentative="1">
+      <w:start w:val="1"/>
+      <w:numFmt w:val="bullet"/>
+      <w:lvlText w:val=""/>
+      <w:lvlJc w:val="left"/>
+      <w:pPr>
+        <w:tabs>
+          <w:tab w:val="num" w:pos="5040"/>
+        </w:tabs>
+        <w:ind w:left="5040" w:hanging="360"/>
+      </w:pPr>
+      <w:rPr>
+        <w:rFonts w:ascii="Wingdings" w:hAnsi="Wingdings" w:hint="default"/>
+        <w:sz w:val="20"/>
+      </w:rPr>
+    </w:lvl>
+    <w:lvl w:ilvl="7" w:tentative="1">
+      <w:start w:val="1"/>
+      <w:numFmt w:val="bullet"/>
+      <w:lvlText w:val=""/>
+      <w:lvlJc w:val="left"/>
+      <w:pPr>
+        <w:tabs>
+          <w:tab w:val="num" w:pos="5760"/>
+        </w:tabs>
+        <w:ind w:left="5760" w:hanging="360"/>
+      </w:pPr>
+      <w:rPr>
+        <w:rFonts w:ascii="Wingdings" w:hAnsi="Wingdings" w:hint="default"/>
+        <w:sz w:val="20"/>
+      </w:rPr>
+    </w:lvl>
+    <w:lvl w:ilvl="8" w:tentative="1">
+      <w:start w:val="1"/>
+      <w:numFmt w:val="bullet"/>
+      <w:lvlText w:val=""/>
+      <w:lvlJc w:val="left"/>
+      <w:pPr>
+        <w:tabs>
+          <w:tab w:val="num" w:pos="6480"/>
+        </w:tabs>
+        <w:ind w:left="6480" w:hanging="360"/>
+      </w:pPr>
+      <w:rPr>
+        <w:rFonts w:ascii="Wingdings" w:hAnsi="Wingdings" w:hint="default"/>
+        <w:sz w:val="20"/>
+      </w:rPr>
+    </w:lvl>
+  </w:abstractNum>
   <w:num w:numId="1" w16cid:durableId="979305968">
+    <w:abstractNumId w:val="2"/>
+  </w:num>
+  <w:num w:numId="2" w16cid:durableId="592516641">
     <w:abstractNumId w:val="0"/>
+  </w:num>
+  <w:num w:numId="3" w16cid:durableId="1950160050">
+    <w:abstractNumId w:val="3"/>
+  </w:num>
+  <w:num w:numId="4" w16cid:durableId="1102603356">
+    <w:abstractNumId w:val="1"/>
   </w:num>
 </w:numbering>
 </file>
@@ -1271,6 +2664,26 @@
       <w:lang w:val="en-US"/>
     </w:rPr>
   </w:style>
+  <w:style w:type="paragraph" w:styleId="Heading2">
+    <w:name w:val="heading 2"/>
+    <w:basedOn w:val="Normal"/>
+    <w:link w:val="Heading2Char"/>
+    <w:uiPriority w:val="9"/>
+    <w:qFormat/>
+    <w:rsid w:val="00C84147"/>
+    <w:pPr>
+      <w:spacing w:before="100" w:beforeAutospacing="1" w:after="100" w:afterAutospacing="1" w:line="240" w:lineRule="auto"/>
+      <w:outlineLvl w:val="1"/>
+    </w:pPr>
+    <w:rPr>
+      <w:rFonts w:ascii="Times New Roman" w:eastAsia="Times New Roman" w:hAnsi="Times New Roman" w:cs="Times New Roman"/>
+      <w:b/>
+      <w:bCs/>
+      <w:sz w:val="36"/>
+      <w:szCs w:val="36"/>
+      <w:lang w:val="en-IN" w:eastAsia="en-IN"/>
+    </w:rPr>
+  </w:style>
   <w:style w:type="character" w:default="1" w:styleId="DefaultParagraphFont">
     <w:name w:val="Default Paragraph Font"/>
     <w:uiPriority w:val="1"/>
@@ -1346,6 +2759,53 @@
     <w:name w:val="mclose"/>
     <w:basedOn w:val="DefaultParagraphFont"/>
     <w:rsid w:val="003345AD"/>
+  </w:style>
+  <w:style w:type="paragraph" w:styleId="NormalWeb">
+    <w:name w:val="Normal (Web)"/>
+    <w:basedOn w:val="Normal"/>
+    <w:uiPriority w:val="99"/>
+    <w:semiHidden/>
+    <w:unhideWhenUsed/>
+    <w:rsid w:val="00C06714"/>
+    <w:pPr>
+      <w:spacing w:before="100" w:beforeAutospacing="1" w:after="100" w:afterAutospacing="1" w:line="240" w:lineRule="auto"/>
+    </w:pPr>
+    <w:rPr>
+      <w:rFonts w:ascii="Times New Roman" w:eastAsia="Times New Roman" w:hAnsi="Times New Roman" w:cs="Times New Roman"/>
+      <w:sz w:val="24"/>
+      <w:szCs w:val="24"/>
+      <w:lang w:val="en-IN" w:eastAsia="en-IN"/>
+    </w:rPr>
+  </w:style>
+  <w:style w:type="character" w:customStyle="1" w:styleId="Heading2Char">
+    <w:name w:val="Heading 2 Char"/>
+    <w:basedOn w:val="DefaultParagraphFont"/>
+    <w:link w:val="Heading2"/>
+    <w:uiPriority w:val="9"/>
+    <w:rsid w:val="00C84147"/>
+    <w:rPr>
+      <w:rFonts w:ascii="Times New Roman" w:eastAsia="Times New Roman" w:hAnsi="Times New Roman" w:cs="Times New Roman"/>
+      <w:b/>
+      <w:bCs/>
+      <w:sz w:val="36"/>
+      <w:szCs w:val="36"/>
+      <w:lang w:eastAsia="en-IN"/>
+    </w:rPr>
+  </w:style>
+  <w:style w:type="character" w:customStyle="1" w:styleId="mrel">
+    <w:name w:val="mrel"/>
+    <w:basedOn w:val="DefaultParagraphFont"/>
+    <w:rsid w:val="00B80C92"/>
+  </w:style>
+  <w:style w:type="character" w:customStyle="1" w:styleId="vlist-s">
+    <w:name w:val="vlist-s"/>
+    <w:basedOn w:val="DefaultParagraphFont"/>
+    <w:rsid w:val="00B80C92"/>
+  </w:style>
+  <w:style w:type="character" w:customStyle="1" w:styleId="mbin">
+    <w:name w:val="mbin"/>
+    <w:basedOn w:val="DefaultParagraphFont"/>
+    <w:rsid w:val="00B80C92"/>
   </w:style>
 </w:styles>
 </file>

</xml_diff>